<commit_message>
[UPD] CFA word +pdf
</commit_message>
<xml_diff>
--- a/fuentes/22230066_CF01_DU.docx
+++ b/fuentes/22230066_CF01_DU.docx
@@ -2661,20 +2661,17 @@
           <w:lang w:eastAsia="es-CO"/>
         </w:rPr>
         <w:lastRenderedPageBreak/>
-        <w:t>oscilar entre 4 y 6 horas diarias, lo que restringe el uso productivo del servicio en horarios nocturnos y matutinos. Asimismo, los elevados costos operacionales (</w:t>
-      </w:r>
-      <w:r>
-        <w:rPr>
-          <w:rStyle w:val="Extranjerismo"/>
-        </w:rPr>
-        <w:t>OPEX</w:t>
-      </w:r>
-      <w:r>
-        <w:rPr>
-          <w:rFonts w:cs="Calibri"/>
-          <w:lang w:eastAsia="es-CO"/>
-        </w:rPr>
-        <w:t>) hacen que el precio del kilovatio - hora (kWh) sea considerablemente superior al del Sistema Interconectado Nacional (SIN), pudiendo alcanzar valores hasta cinco veces mayores.</w:t>
+        <w:t xml:space="preserve">oscilar entre 4 y 6 horas diarias, lo que restringe el uso productivo del servicio en horarios nocturnos y matutinos. Asimismo, los elevados costos operacionales </w:t>
+      </w:r>
+      <w:r>
+        <w:t>(OPEX)</w:t>
+      </w:r>
+      <w:r>
+        <w:rPr>
+          <w:rFonts w:cs="Calibri"/>
+          <w:lang w:eastAsia="es-CO"/>
+        </w:rPr>
+        <w:t xml:space="preserve"> hacen que el precio del kilovatio - hora (kWh) sea considerablemente superior al del Sistema Interconectado Nacional (SIN), pudiendo alcanzar valores hasta cinco veces mayores.</w:t>
       </w:r>
     </w:p>
     <w:p>
@@ -3893,7 +3890,7 @@
           <w:noProof/>
         </w:rPr>
         <w:drawing>
-          <wp:inline distT="0" distB="0" distL="0" distR="0" wp14:anchorId="20BC5EA5" wp14:editId="1CC7D317">
+          <wp:inline distT="0" distB="0" distL="0" distR="0" wp14:anchorId="20BC5EA5" wp14:editId="3B3FA406">
             <wp:extent cx="4613031" cy="2142775"/>
             <wp:effectExtent l="0" t="0" r="0" b="0"/>
             <wp:docPr id="1801701992" name="Imagen 16" descr="Presenta un diagrama de flujo que ilustra el proceso metodológico para la estructuración y diseño del plan de electrificación rural, probablemente asociado al Plan Indicativo de Cobertura (PIC) o el Plan Energético Rural Sostenible (PERS). El proceso inicia con la recopilación de datos clave en tres áreas: Caracterización de la demanda, caracterización de la oferta y caracterización socioeconómica. estos datos son sometidos a una fase de integración y análisis para definir los lineamientos de política y conceptualización de soluciones. posteriormente, el proceso avanza hacia la identificación de proyectos a corto, mediano y largo plazo, lo que culmina en la estructuración y diseño del plan, y finalmente, la Ejecución de proyectos / institucionalización del PERS, cerrando el ciclo con la realimentación hacia la Caracterización Socioeconómica."/>
@@ -4134,10 +4131,10 @@
           <w:noProof/>
         </w:rPr>
         <w:drawing>
-          <wp:inline distT="0" distB="0" distL="0" distR="0" wp14:anchorId="20E7B85C" wp14:editId="0E06250B">
+          <wp:inline distT="0" distB="0" distL="0" distR="0" wp14:anchorId="20E7B85C" wp14:editId="2A16797E">
             <wp:extent cx="4513385" cy="2154204"/>
             <wp:effectExtent l="0" t="0" r="1905" b="0"/>
-            <wp:docPr id="1313366270" name="Imagen 20" descr="Presenta un diagrama de flujo que ilustra el proceso metodológico para la estructuración y diseño del plan de electrificación rural, probablemente asociado al Plan Indicativo de Cobertura (PIC) o el Plan Energético Rural Sostenible (PERS). El proceso inicia con la recopilación de datos clave en tres áreas: Caracterización de la demanda, caracterización de la oferta y caracterización socioeconómica. estos datos son sometidos a una fase de integración y análisis para definir los lineamientos de política y conceptualización de soluciones. posteriormente, el proceso avanza hacia la identificación de proyectos a corto, mediano y largo plazo, lo que culmina en la estructuración y diseño del plan, y finalmente, la Ejecución de proyectos / institucionalización del PERS, cerrando el ciclo con la realimentación hacia la Caracterización Socioeconómica."/>
+            <wp:docPr id="1313366270" name="Imagen 20" descr="Presenta un diagrama de flujo de decisión metodológica para definir la solución de electrificación más adecuada y estimar el Costo de Universalización del servicio de energía eléctrica en Colombia, en el marco del Plan Indicativo de Cobertura (PIC).&#10;El proceso inicia con la identificación de las viviendas sin servicio eléctrico, a partir de información nacional y territorial, los PERS, los Operadores de Red (OR) y los supuestos del PIEC. Este análisis se complementa con datos sobre la infraestructura eléctrica existente y el potencial energético disponible, considerando parámetros técnicos y costos de las diferentes tecnologías, lo que permite seleccionar la alternativa más viable para cada territorio."/>
             <wp:cNvGraphicFramePr>
               <a:graphicFrameLocks xmlns:a="http://schemas.openxmlformats.org/drawingml/2006/main" noChangeAspect="1"/>
             </wp:cNvGraphicFramePr>
@@ -4145,7 +4142,7 @@
               <a:graphicData uri="http://schemas.openxmlformats.org/drawingml/2006/picture">
                 <pic:pic xmlns:pic="http://schemas.openxmlformats.org/drawingml/2006/picture">
                   <pic:nvPicPr>
-                    <pic:cNvPr id="1313366270" name="Imagen 20" descr="Presenta un diagrama de flujo que ilustra el proceso metodológico para la estructuración y diseño del plan de electrificación rural, probablemente asociado al Plan Indicativo de Cobertura (PIC) o el Plan Energético Rural Sostenible (PERS). El proceso inicia con la recopilación de datos clave en tres áreas: Caracterización de la demanda, caracterización de la oferta y caracterización socioeconómica. estos datos son sometidos a una fase de integración y análisis para definir los lineamientos de política y conceptualización de soluciones. posteriormente, el proceso avanza hacia la identificación de proyectos a corto, mediano y largo plazo, lo que culmina en la estructuración y diseño del plan, y finalmente, la Ejecución de proyectos / institucionalización del PERS, cerrando el ciclo con la realimentación hacia la Caracterización Socioeconómica."/>
+                    <pic:cNvPr id="1313366270" name="Imagen 20" descr="Presenta un diagrama de flujo de decisión metodológica para definir la solución de electrificación más adecuada y estimar el Costo de Universalización del servicio de energía eléctrica en Colombia, en el marco del Plan Indicativo de Cobertura (PIC).&#10;El proceso inicia con la identificación de las viviendas sin servicio eléctrico, a partir de información nacional y territorial, los PERS, los Operadores de Red (OR) y los supuestos del PIEC. Este análisis se complementa con datos sobre la infraestructura eléctrica existente y el potencial energético disponible, considerando parámetros técnicos y costos de las diferentes tecnologías, lo que permite seleccionar la alternativa más viable para cada territorio."/>
                     <pic:cNvPicPr>
                       <a:picLocks noChangeAspect="1" noChangeArrowheads="1"/>
                     </pic:cNvPicPr>
@@ -6410,7 +6407,23 @@
           <w:bCs/>
           <w:lang w:eastAsia="es-CO"/>
         </w:rPr>
-        <w:t>para la generación eléctrica local mediante plantas térmicas. su alto costo e impacto ambiental justifican el análisis de alternativas.</w:t>
+        <w:t xml:space="preserve">para la generación eléctrica local mediante plantas térmicas. </w:t>
+      </w:r>
+      <w:r>
+        <w:rPr>
+          <w:rFonts w:cs="Calibri"/>
+          <w:bCs/>
+          <w:lang w:eastAsia="es-CO"/>
+        </w:rPr>
+        <w:t>S</w:t>
+      </w:r>
+      <w:r>
+        <w:rPr>
+          <w:rFonts w:cs="Calibri"/>
+          <w:bCs/>
+          <w:lang w:eastAsia="es-CO"/>
+        </w:rPr>
+        <w:t>u alto costo e impacto ambiental justifican el análisis de alternativas.</w:t>
       </w:r>
     </w:p>
     <w:p>
@@ -6490,16 +6503,14 @@
         </w:rPr>
         <w:t xml:space="preserve">servicio de suministro eléctrico que no es continuo (24 horas al día), sino que se restringe a horarios limitados (ejemplo: 4 a 6 horas diarias), común en las </w:t>
       </w:r>
-      <w:proofErr w:type="spellStart"/>
       <w:r>
         <w:rPr>
           <w:rFonts w:cs="Calibri"/>
           <w:bCs/>
           <w:lang w:eastAsia="es-CO"/>
         </w:rPr>
-        <w:t>zni</w:t>
-      </w:r>
-      <w:proofErr w:type="spellEnd"/>
+        <w:t>ZNI</w:t>
+      </w:r>
       <w:r>
         <w:rPr>
           <w:rFonts w:cs="Calibri"/>
@@ -6644,7 +6655,23 @@
           <w:bCs/>
           <w:lang w:eastAsia="es-CO"/>
         </w:rPr>
-        <w:t>nterconectadas. es la entidad promotora del gobierno nacional para la electrificación rural.</w:t>
+        <w:t xml:space="preserve">nterconectadas. </w:t>
+      </w:r>
+      <w:r>
+        <w:rPr>
+          <w:rFonts w:cs="Calibri"/>
+          <w:bCs/>
+          <w:lang w:eastAsia="es-CO"/>
+        </w:rPr>
+        <w:t>E</w:t>
+      </w:r>
+      <w:r>
+        <w:rPr>
+          <w:rFonts w:cs="Calibri"/>
+          <w:bCs/>
+          <w:lang w:eastAsia="es-CO"/>
+        </w:rPr>
+        <w:t>s la entidad promotora del gobierno nacional para la electrificación rural.</w:t>
       </w:r>
     </w:p>
     <w:p>
@@ -7533,7 +7560,7 @@
                 <w:sz w:val="28"/>
                 <w:szCs w:val="28"/>
               </w:rPr>
-              <w:t>Dirección General</w:t>
+              <w:t>Centro Agroturístico - Regional Santander</w:t>
             </w:r>
           </w:p>
         </w:tc>
@@ -18197,6 +18224,7 @@
   <w:style w:type="character" w:default="1" w:styleId="Fuentedeprrafopredeter">
     <w:name w:val="Default Paragraph Font"/>
     <w:uiPriority w:val="1"/>
+    <w:semiHidden/>
     <w:unhideWhenUsed/>
   </w:style>
   <w:style w:type="table" w:default="1" w:styleId="Tablanormal">
@@ -19414,21 +19442,6 @@
 </file>
 
 <file path=customXml/item1.xml><?xml version="1.0" encoding="utf-8"?>
-<b:Sources xmlns:b="http://schemas.openxmlformats.org/officeDocument/2006/bibliography" xmlns="http://schemas.openxmlformats.org/officeDocument/2006/bibliography" SelectedStyle="\APASixthEditionOfficeOnline.xsl" StyleName="APA" Version="6"/>
-</file>
-
-<file path=customXml/item2.xml><?xml version="1.0" encoding="utf-8"?>
-<p:properties xmlns:p="http://schemas.microsoft.com/office/2006/metadata/properties" xmlns:xsi="http://www.w3.org/2001/XMLSchema-instance" xmlns:pc="http://schemas.microsoft.com/office/infopath/2007/PartnerControls">
-  <documentManagement>
-    <TaxCatchAll xmlns="13c90a0b-73bc-4dc0-be5f-28d77b615beb" xsi:nil="true"/>
-    <lcf76f155ced4ddcb4097134ff3c332f xmlns="13c93bba-48ce-428c-bfe5-88b42c19b028">
-      <Terms xmlns="http://schemas.microsoft.com/office/infopath/2007/PartnerControls"/>
-    </lcf76f155ced4ddcb4097134ff3c332f>
-  </documentManagement>
-</p:properties>
-</file>
-
-<file path=customXml/item3.xml><?xml version="1.0" encoding="utf-8"?>
 <ct:contentTypeSchema xmlns:ct="http://schemas.microsoft.com/office/2006/metadata/contentType" xmlns:ma="http://schemas.microsoft.com/office/2006/metadata/properties/metaAttributes" ct:_="" ma:_="" ma:contentTypeName="Documento" ma:contentTypeID="0x0101006A81D6BD42E8DF4C91013959704817E1" ma:contentTypeVersion="15" ma:contentTypeDescription="Crear nuevo documento." ma:contentTypeScope="" ma:versionID="bf4f72ffd194f0963ff564daca6869f7">
   <xsd:schema xmlns:xsd="http://www.w3.org/2001/XMLSchema" xmlns:xs="http://www.w3.org/2001/XMLSchema" xmlns:p="http://schemas.microsoft.com/office/2006/metadata/properties" xmlns:ns2="13c90a0b-73bc-4dc0-be5f-28d77b615beb" xmlns:ns3="13c93bba-48ce-428c-bfe5-88b42c19b028" targetNamespace="http://schemas.microsoft.com/office/2006/metadata/properties" ma:root="true" ma:fieldsID="8718d6f4873a5b1392a45044efa78385" ns2:_="" ns3:_="">
     <xsd:import namespace="13c90a0b-73bc-4dc0-be5f-28d77b615beb"/>
@@ -19663,6 +19676,21 @@
 </ct:contentTypeSchema>
 </file>
 
+<file path=customXml/item2.xml><?xml version="1.0" encoding="utf-8"?>
+<p:properties xmlns:p="http://schemas.microsoft.com/office/2006/metadata/properties" xmlns:xsi="http://www.w3.org/2001/XMLSchema-instance" xmlns:pc="http://schemas.microsoft.com/office/infopath/2007/PartnerControls">
+  <documentManagement>
+    <TaxCatchAll xmlns="13c90a0b-73bc-4dc0-be5f-28d77b615beb" xsi:nil="true"/>
+    <lcf76f155ced4ddcb4097134ff3c332f xmlns="13c93bba-48ce-428c-bfe5-88b42c19b028">
+      <Terms xmlns="http://schemas.microsoft.com/office/infopath/2007/PartnerControls"/>
+    </lcf76f155ced4ddcb4097134ff3c332f>
+  </documentManagement>
+</p:properties>
+</file>
+
+<file path=customXml/item3.xml><?xml version="1.0" encoding="utf-8"?>
+<b:Sources xmlns:b="http://schemas.openxmlformats.org/officeDocument/2006/bibliography" xmlns="http://schemas.openxmlformats.org/officeDocument/2006/bibliography" SelectedStyle="\APASixthEditionOfficeOnline.xsl" StyleName="APA" Version="6"/>
+</file>
+
 <file path=customXml/item4.xml><?xml version="1.0" encoding="utf-8"?>
 <?mso-contentType ?>
 <FormTemplates xmlns="http://schemas.microsoft.com/sharepoint/v3/contenttype/forms">
@@ -19673,11 +19701,7 @@
 </file>
 
 <file path=customXml/itemProps1.xml><?xml version="1.0" encoding="utf-8"?>
-<ds:datastoreItem xmlns:ds="http://schemas.openxmlformats.org/officeDocument/2006/customXml" ds:itemID="{1AF2C25B-FB23-49D7-861B-D97474F002D2}">
-  <ds:schemaRefs>
-    <ds:schemaRef ds:uri="http://schemas.openxmlformats.org/officeDocument/2006/bibliography"/>
-  </ds:schemaRefs>
-</ds:datastoreItem>
+<ds:datastoreItem xmlns:ds="http://schemas.openxmlformats.org/officeDocument/2006/customXml" ds:itemID="{FF85FEBE-F57C-46C8-86B4-D1FC3BAFB43E}"/>
 </file>
 
 <file path=customXml/itemProps2.xml><?xml version="1.0" encoding="utf-8"?>
@@ -19692,7 +19716,11 @@
 </file>
 
 <file path=customXml/itemProps3.xml><?xml version="1.0" encoding="utf-8"?>
-<ds:datastoreItem xmlns:ds="http://schemas.openxmlformats.org/officeDocument/2006/customXml" ds:itemID="{73A49EAA-4EAB-47AF-A900-1EBD396656C6}"/>
+<ds:datastoreItem xmlns:ds="http://schemas.openxmlformats.org/officeDocument/2006/customXml" ds:itemID="{1AF2C25B-FB23-49D7-861B-D97474F002D2}">
+  <ds:schemaRefs>
+    <ds:schemaRef ds:uri="http://schemas.openxmlformats.org/officeDocument/2006/bibliography"/>
+  </ds:schemaRefs>
+</ds:datastoreItem>
 </file>
 
 <file path=customXml/itemProps4.xml><?xml version="1.0" encoding="utf-8"?>

</xml_diff>